<commit_message>
Implementación de seguridad: cierre de sesión por inactividad (20min), manejo de cookies HttpOnly y alertas automáticas con SweetAlert2
</commit_message>
<xml_diff>
--- a/app/static/plantillas/02 ANALISIS DEL SECTOR.docx
+++ b/app/static/plantillas/02 ANALISIS DEL SECTOR.docx
@@ -1781,21 +1781,18 @@
         <w:spacing w:lineRule="auto" w:line="360"/>
         <w:jc w:val="both"/>
         <w:rPr>
-          <w:rFonts w:ascii="Arial" w:hAnsi="Arial" w:cs="Arial"/>
-          <w:sz w:val="20"/>
-          <w:szCs w:val="20"/>
           <w:u w:val="single"/>
-          <w:lang w:val="es-CO"/>
-        </w:rPr>
-      </w:pPr>
-      <w:r>
-        <w:rPr>
-          <w:rFonts w:cs="Arial" w:ascii="Arial" w:hAnsi="Arial"/>
-          <w:sz w:val="20"/>
-          <w:szCs w:val="20"/>
-          <w:u w:val="single"/>
-          <w:lang w:val="es-CO"/>
-        </w:rPr>
+        </w:rPr>
+      </w:pPr>
+      <w:r>
+        <w:rPr>
+          <w:rFonts w:cs="Arial" w:ascii="Arial" w:hAnsi="Arial"/>
+          <w:sz w:val="20"/>
+          <w:szCs w:val="20"/>
+          <w:u w:val="none"/>
+          <w:lang w:val="es-CO"/>
+        </w:rPr>
+        <w:t xml:space="preserve">{% if cantidad_cotizaciones == 2 %} </w:t>
       </w:r>
     </w:p>
     <w:tbl>
@@ -2258,16 +2255,17 @@
           <w:rFonts w:ascii="Arial" w:hAnsi="Arial" w:cs="Arial"/>
           <w:sz w:val="20"/>
           <w:szCs w:val="20"/>
-          <w:lang w:val="es-CO"/>
-        </w:rPr>
-      </w:pPr>
-      <w:r>
-        <w:rPr>
-          <w:rFonts w:cs="Arial" w:ascii="Arial" w:hAnsi="Arial"/>
-          <w:sz w:val="20"/>
-          <w:szCs w:val="20"/>
-        </w:rPr>
-        <w:t>{% if contratista3 %}</w:t>
+          <w:u w:val="single"/>
+          <w:lang w:val="es-CO"/>
+        </w:rPr>
+      </w:pPr>
+      <w:r>
+        <w:rPr>
+          <w:rFonts w:cs="Arial" w:ascii="Arial" w:hAnsi="Arial"/>
+          <w:sz w:val="20"/>
+          <w:szCs w:val="20"/>
+        </w:rPr>
+        <w:t xml:space="preserve">{% else %} </w:t>
       </w:r>
     </w:p>
     <w:tbl>
@@ -2349,7 +2347,7 @@
                 <w:szCs w:val="20"/>
                 <w:lang w:val="es-CO" w:eastAsia="en-US" w:bidi="ar-SA"/>
               </w:rPr>
-              <w:t>{{ contratista3 }}</w:t>
+              <w:t>{{ contratista }}</w:t>
             </w:r>
           </w:p>
         </w:tc>
@@ -2414,7 +2412,7 @@
                 <w:szCs w:val="20"/>
                 <w:lang w:val="es-CO" w:eastAsia="en-US" w:bidi="ar-SA"/>
               </w:rPr>
-              <w:t>{{ doc_contratista3 }}</w:t>
+              <w:t>{{ doc_contratista }}</w:t>
             </w:r>
           </w:p>
         </w:tc>
@@ -2488,12 +2486,485 @@
     <w:p>
       <w:pPr>
         <w:pStyle w:val="Normal"/>
+        <w:spacing w:lineRule="auto" w:line="276"/>
+        <w:jc w:val="both"/>
+        <w:rPr>
+          <w:rFonts w:ascii="Arial" w:hAnsi="Arial" w:cs="Arial"/>
+          <w:sz w:val="20"/>
+          <w:szCs w:val="20"/>
+          <w:lang w:val="es-CO"/>
+        </w:rPr>
+      </w:pPr>
+      <w:r>
+        <w:rPr>
+          <w:rFonts w:cs="Arial" w:ascii="Arial" w:hAnsi="Arial"/>
+          <w:sz w:val="20"/>
+          <w:szCs w:val="20"/>
+          <w:lang w:val="es-CO"/>
+        </w:rPr>
+      </w:r>
+    </w:p>
+    <w:tbl>
+      <w:tblPr>
+        <w:tblStyle w:val="Tablaconcuadrcula"/>
+        <w:tblW w:w="9545" w:type="dxa"/>
+        <w:jc w:val="start"/>
+        <w:tblInd w:w="0" w:type="dxa"/>
+        <w:tblLayout w:type="fixed"/>
+        <w:tblCellMar>
+          <w:top w:w="0" w:type="dxa"/>
+          <w:start w:w="108" w:type="dxa"/>
+          <w:bottom w:w="0" w:type="dxa"/>
+          <w:end w:w="108" w:type="dxa"/>
+        </w:tblCellMar>
+        <w:tblLook w:firstRow="1" w:noVBand="1" w:lastRow="0" w:firstColumn="1" w:lastColumn="0" w:noHBand="0" w:val="04a0"/>
+      </w:tblPr>
+      <w:tblGrid>
+        <w:gridCol w:w="4772"/>
+        <w:gridCol w:w="4773"/>
+      </w:tblGrid>
+      <w:tr>
+        <w:trPr/>
+        <w:tc>
+          <w:tcPr>
+            <w:tcW w:w="4772" w:type="dxa"/>
+            <w:tcBorders/>
+          </w:tcPr>
+          <w:p>
+            <w:pPr>
+              <w:pStyle w:val="Normal"/>
+              <w:widowControl/>
+              <w:suppressAutoHyphens w:val="true"/>
+              <w:spacing w:lineRule="auto" w:line="276" w:before="0" w:after="0"/>
+              <w:jc w:val="both"/>
+              <w:rPr>
+                <w:rFonts w:ascii="Arial" w:hAnsi="Arial" w:cs="Arial"/>
+                <w:sz w:val="20"/>
+                <w:szCs w:val="20"/>
+                <w:lang w:val="es-CO"/>
+              </w:rPr>
+            </w:pPr>
+            <w:r>
+              <w:rPr>
+                <w:rFonts w:cs="Arial" w:ascii="Arial" w:hAnsi="Arial"/>
+                <w:kern w:val="0"/>
+                <w:sz w:val="20"/>
+                <w:szCs w:val="20"/>
+                <w:lang w:val="es-CO" w:eastAsia="en-US" w:bidi="ar-SA"/>
+              </w:rPr>
+              <w:t>Nombre o razón social</w:t>
+            </w:r>
+          </w:p>
+        </w:tc>
+        <w:tc>
+          <w:tcPr>
+            <w:tcW w:w="4773" w:type="dxa"/>
+            <w:tcBorders/>
+          </w:tcPr>
+          <w:p>
+            <w:pPr>
+              <w:pStyle w:val="Normal"/>
+              <w:widowControl/>
+              <w:suppressAutoHyphens w:val="true"/>
+              <w:spacing w:lineRule="auto" w:line="276" w:before="0" w:after="0"/>
+              <w:jc w:val="both"/>
+              <w:rPr>
+                <w:rFonts w:ascii="Arial" w:hAnsi="Arial" w:cs="Arial"/>
+                <w:sz w:val="20"/>
+                <w:szCs w:val="20"/>
+                <w:lang w:val="es-CO"/>
+              </w:rPr>
+            </w:pPr>
+            <w:r>
+              <w:rPr>
+                <w:rFonts w:cs="Arial" w:ascii="Arial" w:hAnsi="Arial"/>
+                <w:kern w:val="0"/>
+                <w:sz w:val="20"/>
+                <w:szCs w:val="20"/>
+                <w:lang w:val="es-CO" w:eastAsia="en-US" w:bidi="ar-SA"/>
+              </w:rPr>
+              <w:t>{{ contratista2 }}</w:t>
+            </w:r>
+          </w:p>
+        </w:tc>
+      </w:tr>
+      <w:tr>
+        <w:trPr/>
+        <w:tc>
+          <w:tcPr>
+            <w:tcW w:w="4772" w:type="dxa"/>
+            <w:tcBorders/>
+          </w:tcPr>
+          <w:p>
+            <w:pPr>
+              <w:pStyle w:val="Normal"/>
+              <w:widowControl/>
+              <w:suppressAutoHyphens w:val="true"/>
+              <w:spacing w:lineRule="auto" w:line="276" w:before="0" w:after="0"/>
+              <w:jc w:val="both"/>
+              <w:rPr>
+                <w:rFonts w:ascii="Arial" w:hAnsi="Arial" w:cs="Arial"/>
+                <w:sz w:val="20"/>
+                <w:szCs w:val="20"/>
+                <w:lang w:val="es-CO"/>
+              </w:rPr>
+            </w:pPr>
+            <w:r>
+              <w:rPr>
+                <w:rFonts w:cs="Arial" w:ascii="Arial" w:hAnsi="Arial"/>
+                <w:kern w:val="0"/>
+                <w:sz w:val="20"/>
+                <w:szCs w:val="20"/>
+                <w:lang w:val="es-CO" w:eastAsia="en-US" w:bidi="ar-SA"/>
+              </w:rPr>
+              <w:t>Identificación</w:t>
+            </w:r>
+          </w:p>
+        </w:tc>
+        <w:tc>
+          <w:tcPr>
+            <w:tcW w:w="4773" w:type="dxa"/>
+            <w:tcBorders/>
+          </w:tcPr>
+          <w:p>
+            <w:pPr>
+              <w:pStyle w:val="Normal"/>
+              <w:widowControl/>
+              <w:suppressAutoHyphens w:val="true"/>
+              <w:spacing w:lineRule="auto" w:line="276" w:before="0" w:after="0"/>
+              <w:jc w:val="both"/>
+              <w:rPr>
+                <w:rFonts w:ascii="Arial" w:hAnsi="Arial" w:cs="Arial"/>
+                <w:sz w:val="20"/>
+                <w:szCs w:val="20"/>
+                <w:lang w:val="es-CO"/>
+              </w:rPr>
+            </w:pPr>
+            <w:r>
+              <w:rPr>
+                <w:rFonts w:cs="Arial" w:ascii="Arial" w:hAnsi="Arial"/>
+                <w:kern w:val="0"/>
+                <w:sz w:val="20"/>
+                <w:szCs w:val="20"/>
+                <w:lang w:val="es-CO" w:eastAsia="en-US" w:bidi="ar-SA"/>
+              </w:rPr>
+              <w:t>{{ doc_contratista2 }}</w:t>
+            </w:r>
+          </w:p>
+        </w:tc>
+      </w:tr>
+      <w:tr>
+        <w:trPr/>
+        <w:tc>
+          <w:tcPr>
+            <w:tcW w:w="4772" w:type="dxa"/>
+            <w:tcBorders/>
+          </w:tcPr>
+          <w:p>
+            <w:pPr>
+              <w:pStyle w:val="Normal"/>
+              <w:widowControl/>
+              <w:suppressAutoHyphens w:val="true"/>
+              <w:spacing w:lineRule="auto" w:line="276" w:before="0" w:after="0"/>
+              <w:jc w:val="both"/>
+              <w:rPr>
+                <w:rFonts w:ascii="Arial" w:hAnsi="Arial" w:cs="Arial"/>
+                <w:sz w:val="20"/>
+                <w:szCs w:val="20"/>
+                <w:lang w:val="es-CO"/>
+              </w:rPr>
+            </w:pPr>
+            <w:r>
+              <w:rPr>
+                <w:rFonts w:cs="Arial" w:ascii="Arial" w:hAnsi="Arial"/>
+                <w:kern w:val="0"/>
+                <w:sz w:val="20"/>
+                <w:szCs w:val="20"/>
+                <w:lang w:val="es-CO" w:eastAsia="en-US" w:bidi="ar-SA"/>
+              </w:rPr>
+              <w:t>Área comercial de experiencia</w:t>
+            </w:r>
+          </w:p>
+        </w:tc>
+        <w:tc>
+          <w:tcPr>
+            <w:tcW w:w="4773" w:type="dxa"/>
+            <w:tcBorders/>
+          </w:tcPr>
+          <w:p>
+            <w:pPr>
+              <w:pStyle w:val="Normal"/>
+              <w:widowControl/>
+              <w:suppressAutoHyphens w:val="true"/>
+              <w:spacing w:lineRule="auto" w:line="276" w:before="0" w:after="0"/>
+              <w:jc w:val="both"/>
+              <w:rPr>
+                <w:rFonts w:ascii="Arial" w:hAnsi="Arial" w:cs="Arial"/>
+                <w:sz w:val="20"/>
+                <w:szCs w:val="20"/>
+                <w:lang w:val="es-CO"/>
+              </w:rPr>
+            </w:pPr>
+            <w:r>
+              <w:rPr>
+                <w:rFonts w:cs="Arial" w:ascii="Arial" w:hAnsi="Arial"/>
+                <w:kern w:val="0"/>
+                <w:sz w:val="20"/>
+                <w:szCs w:val="20"/>
+                <w:lang w:val="es-CO" w:eastAsia="en-US" w:bidi="ar-SA"/>
+              </w:rPr>
+              <w:t>{{ tipo_contrato }}</w:t>
+            </w:r>
+          </w:p>
+        </w:tc>
+      </w:tr>
+    </w:tbl>
+    <w:p>
+      <w:pPr>
+        <w:pStyle w:val="Normal"/>
+        <w:spacing w:lineRule="auto" w:line="276"/>
+        <w:jc w:val="both"/>
+        <w:rPr>
+          <w:rFonts w:ascii="Arial" w:hAnsi="Arial" w:cs="Arial"/>
+          <w:sz w:val="20"/>
+          <w:szCs w:val="20"/>
+          <w:u w:val="single"/>
+        </w:rPr>
+      </w:pPr>
+      <w:r>
+        <w:rPr>
+          <w:rFonts w:cs="Arial" w:ascii="Arial" w:hAnsi="Arial"/>
+          <w:sz w:val="20"/>
+          <w:szCs w:val="20"/>
+          <w:u w:val="single"/>
+        </w:rPr>
+      </w:r>
+    </w:p>
+    <w:tbl>
+      <w:tblPr>
+        <w:tblStyle w:val="Tablaconcuadrcula"/>
+        <w:tblW w:w="9545" w:type="dxa"/>
+        <w:jc w:val="start"/>
+        <w:tblInd w:w="0" w:type="dxa"/>
+        <w:tblLayout w:type="fixed"/>
+        <w:tblCellMar>
+          <w:top w:w="0" w:type="dxa"/>
+          <w:start w:w="108" w:type="dxa"/>
+          <w:bottom w:w="0" w:type="dxa"/>
+          <w:end w:w="108" w:type="dxa"/>
+        </w:tblCellMar>
+        <w:tblLook w:firstRow="1" w:noVBand="1" w:lastRow="0" w:firstColumn="1" w:lastColumn="0" w:noHBand="0" w:val="04a0"/>
+      </w:tblPr>
+      <w:tblGrid>
+        <w:gridCol w:w="4772"/>
+        <w:gridCol w:w="4773"/>
+      </w:tblGrid>
+      <w:tr>
+        <w:trPr/>
+        <w:tc>
+          <w:tcPr>
+            <w:tcW w:w="4772" w:type="dxa"/>
+            <w:tcBorders/>
+          </w:tcPr>
+          <w:p>
+            <w:pPr>
+              <w:pStyle w:val="Normal"/>
+              <w:widowControl/>
+              <w:suppressAutoHyphens w:val="true"/>
+              <w:spacing w:lineRule="auto" w:line="276" w:before="0" w:after="0"/>
+              <w:jc w:val="both"/>
+              <w:rPr>
+                <w:rFonts w:ascii="Arial" w:hAnsi="Arial" w:cs="Arial"/>
+                <w:sz w:val="20"/>
+                <w:szCs w:val="20"/>
+                <w:lang w:val="es-CO"/>
+              </w:rPr>
+            </w:pPr>
+            <w:r>
+              <w:rPr>
+                <w:rFonts w:cs="Arial" w:ascii="Arial" w:hAnsi="Arial"/>
+                <w:kern w:val="0"/>
+                <w:sz w:val="20"/>
+                <w:szCs w:val="20"/>
+                <w:lang w:val="es-CO" w:eastAsia="en-US" w:bidi="ar-SA"/>
+              </w:rPr>
+              <w:t>Nombre o razón social</w:t>
+            </w:r>
+          </w:p>
+        </w:tc>
+        <w:tc>
+          <w:tcPr>
+            <w:tcW w:w="4773" w:type="dxa"/>
+            <w:tcBorders/>
+          </w:tcPr>
+          <w:p>
+            <w:pPr>
+              <w:pStyle w:val="Normal"/>
+              <w:widowControl/>
+              <w:suppressAutoHyphens w:val="true"/>
+              <w:spacing w:lineRule="auto" w:line="276" w:before="0" w:after="0"/>
+              <w:jc w:val="both"/>
+              <w:rPr>
+                <w:rFonts w:ascii="Arial" w:hAnsi="Arial" w:cs="Arial"/>
+                <w:sz w:val="20"/>
+                <w:szCs w:val="20"/>
+                <w:lang w:val="es-CO"/>
+              </w:rPr>
+            </w:pPr>
+            <w:r>
+              <w:rPr>
+                <w:rFonts w:cs="Arial" w:ascii="Arial" w:hAnsi="Arial"/>
+                <w:kern w:val="0"/>
+                <w:sz w:val="20"/>
+                <w:szCs w:val="20"/>
+                <w:lang w:val="es-CO" w:eastAsia="en-US" w:bidi="ar-SA"/>
+              </w:rPr>
+              <w:t>{{ contratista3 }}</w:t>
+            </w:r>
+          </w:p>
+        </w:tc>
+      </w:tr>
+      <w:tr>
+        <w:trPr/>
+        <w:tc>
+          <w:tcPr>
+            <w:tcW w:w="4772" w:type="dxa"/>
+            <w:tcBorders/>
+          </w:tcPr>
+          <w:p>
+            <w:pPr>
+              <w:pStyle w:val="Normal"/>
+              <w:widowControl/>
+              <w:suppressAutoHyphens w:val="true"/>
+              <w:spacing w:lineRule="auto" w:line="276" w:before="0" w:after="0"/>
+              <w:jc w:val="both"/>
+              <w:rPr>
+                <w:rFonts w:ascii="Arial" w:hAnsi="Arial" w:cs="Arial"/>
+                <w:sz w:val="20"/>
+                <w:szCs w:val="20"/>
+                <w:lang w:val="es-CO"/>
+              </w:rPr>
+            </w:pPr>
+            <w:r>
+              <w:rPr>
+                <w:rFonts w:cs="Arial" w:ascii="Arial" w:hAnsi="Arial"/>
+                <w:kern w:val="0"/>
+                <w:sz w:val="20"/>
+                <w:szCs w:val="20"/>
+                <w:lang w:val="es-CO" w:eastAsia="en-US" w:bidi="ar-SA"/>
+              </w:rPr>
+              <w:t>Identificación</w:t>
+            </w:r>
+          </w:p>
+        </w:tc>
+        <w:tc>
+          <w:tcPr>
+            <w:tcW w:w="4773" w:type="dxa"/>
+            <w:tcBorders/>
+          </w:tcPr>
+          <w:p>
+            <w:pPr>
+              <w:pStyle w:val="Normal"/>
+              <w:widowControl/>
+              <w:suppressAutoHyphens w:val="true"/>
+              <w:spacing w:lineRule="auto" w:line="276" w:before="0" w:after="0"/>
+              <w:jc w:val="both"/>
+              <w:rPr>
+                <w:rFonts w:ascii="Arial" w:hAnsi="Arial" w:cs="Arial"/>
+                <w:sz w:val="20"/>
+                <w:szCs w:val="20"/>
+                <w:lang w:val="es-CO"/>
+              </w:rPr>
+            </w:pPr>
+            <w:r>
+              <w:rPr>
+                <w:rFonts w:cs="Arial" w:ascii="Arial" w:hAnsi="Arial"/>
+                <w:kern w:val="0"/>
+                <w:sz w:val="20"/>
+                <w:szCs w:val="20"/>
+                <w:lang w:val="es-CO" w:eastAsia="en-US" w:bidi="ar-SA"/>
+              </w:rPr>
+              <w:t>{{ doc_contratista3 }}</w:t>
+            </w:r>
+          </w:p>
+        </w:tc>
+      </w:tr>
+      <w:tr>
+        <w:trPr/>
+        <w:tc>
+          <w:tcPr>
+            <w:tcW w:w="4772" w:type="dxa"/>
+            <w:tcBorders/>
+          </w:tcPr>
+          <w:p>
+            <w:pPr>
+              <w:pStyle w:val="Normal"/>
+              <w:widowControl/>
+              <w:suppressAutoHyphens w:val="true"/>
+              <w:spacing w:lineRule="auto" w:line="276" w:before="0" w:after="0"/>
+              <w:jc w:val="both"/>
+              <w:rPr>
+                <w:rFonts w:ascii="Arial" w:hAnsi="Arial" w:cs="Arial"/>
+                <w:sz w:val="20"/>
+                <w:szCs w:val="20"/>
+                <w:lang w:val="es-CO"/>
+              </w:rPr>
+            </w:pPr>
+            <w:r>
+              <w:rPr>
+                <w:rFonts w:cs="Arial" w:ascii="Arial" w:hAnsi="Arial"/>
+                <w:kern w:val="0"/>
+                <w:sz w:val="20"/>
+                <w:szCs w:val="20"/>
+                <w:lang w:val="es-CO" w:eastAsia="en-US" w:bidi="ar-SA"/>
+              </w:rPr>
+              <w:t>Área comercial de experiencia</w:t>
+            </w:r>
+          </w:p>
+        </w:tc>
+        <w:tc>
+          <w:tcPr>
+            <w:tcW w:w="4773" w:type="dxa"/>
+            <w:tcBorders/>
+          </w:tcPr>
+          <w:p>
+            <w:pPr>
+              <w:pStyle w:val="Normal"/>
+              <w:widowControl/>
+              <w:suppressAutoHyphens w:val="true"/>
+              <w:spacing w:lineRule="auto" w:line="276" w:before="0" w:after="0"/>
+              <w:jc w:val="both"/>
+              <w:rPr>
+                <w:rFonts w:ascii="Arial" w:hAnsi="Arial" w:cs="Arial"/>
+                <w:sz w:val="20"/>
+                <w:szCs w:val="20"/>
+                <w:lang w:val="es-CO"/>
+              </w:rPr>
+            </w:pPr>
+            <w:r>
+              <w:rPr>
+                <w:rFonts w:cs="Arial" w:ascii="Arial" w:hAnsi="Arial"/>
+                <w:kern w:val="0"/>
+                <w:sz w:val="20"/>
+                <w:szCs w:val="20"/>
+                <w:lang w:val="es-CO" w:eastAsia="en-US" w:bidi="ar-SA"/>
+              </w:rPr>
+              <w:t>{{ tipo_contrato }}</w:t>
+            </w:r>
+          </w:p>
+        </w:tc>
+      </w:tr>
+    </w:tbl>
+    <w:p>
+      <w:pPr>
+        <w:pStyle w:val="Normal"/>
         <w:spacing w:lineRule="auto" w:line="360"/>
         <w:rPr>
           <w:rFonts w:ascii="Arial" w:hAnsi="Arial" w:cs="Arial"/>
           <w:bCs/>
           <w:sz w:val="20"/>
           <w:szCs w:val="20"/>
+          <w:u w:val="single"/>
           <w:lang w:val="es-CO"/>
         </w:rPr>
       </w:pPr>
@@ -2503,8 +2974,9 @@
           <w:bCs/>
           <w:sz w:val="20"/>
           <w:szCs w:val="20"/>
-        </w:rPr>
-        <w:t>{% endif %}</w:t>
+          <w:lang w:val="es-CO"/>
+        </w:rPr>
+        <w:t xml:space="preserve">{% endif %} </w:t>
       </w:r>
     </w:p>
     <w:p>
@@ -4845,15 +5317,15 @@
       <w:lang w:val="es-CO" w:eastAsia="en-US" w:bidi="ar-SA"/>
     </w:rPr>
   </w:style>
-  <w:style w:type="paragraph" w:styleId="Cabeceraypie">
-    <w:name w:val="Cabecera y pie"/>
+  <w:style w:type="paragraph" w:styleId="Cabeceraypieuser">
+    <w:name w:val="Cabecera y pie (user)"/>
     <w:basedOn w:val="Normal"/>
     <w:qFormat/>
     <w:pPr/>
     <w:rPr/>
   </w:style>
-  <w:style w:type="paragraph" w:styleId="Cabeceraypieuser">
-    <w:name w:val="Cabecera y pie (user)"/>
+  <w:style w:type="paragraph" w:styleId="Cabeceraypie">
+    <w:name w:val="Cabecera y pie"/>
     <w:basedOn w:val="Normal"/>
     <w:qFormat/>
     <w:pPr/>
@@ -4926,12 +5398,35 @@
       <w:lang w:val="es-CO"/>
     </w:rPr>
   </w:style>
-  <w:style w:type="paragraph" w:styleId="Contenidodelmarco">
-    <w:name w:val="Contenido del marco"/>
+  <w:style w:type="paragraph" w:styleId="Contenidodelmarcouser">
+    <w:name w:val="Contenido del marco (user)"/>
     <w:basedOn w:val="Normal"/>
     <w:qFormat/>
     <w:pPr/>
     <w:rPr/>
+  </w:style>
+  <w:style w:type="paragraph" w:styleId="Contenidodelatablauser">
+    <w:name w:val="Contenido de la tabla (user)"/>
+    <w:basedOn w:val="Normal"/>
+    <w:qFormat/>
+    <w:pPr>
+      <w:widowControl w:val="false"/>
+      <w:suppressLineNumbers/>
+    </w:pPr>
+    <w:rPr/>
+  </w:style>
+  <w:style w:type="paragraph" w:styleId="Ttulodelatablauser">
+    <w:name w:val="Título de la tabla (user)"/>
+    <w:basedOn w:val="Contenidodelatablauser"/>
+    <w:qFormat/>
+    <w:pPr>
+      <w:suppressLineNumbers/>
+      <w:jc w:val="center"/>
+    </w:pPr>
+    <w:rPr>
+      <w:b/>
+      <w:bCs/>
+    </w:rPr>
   </w:style>
   <w:style w:type="paragraph" w:styleId="Contenidodelatabla">
     <w:name w:val="Contenido de la tabla"/>
@@ -4956,31 +5451,8 @@
       <w:bCs/>
     </w:rPr>
   </w:style>
-  <w:style w:type="paragraph" w:styleId="Contenidodelatablauser">
-    <w:name w:val="Contenido de la tabla (user)"/>
-    <w:basedOn w:val="Normal"/>
-    <w:qFormat/>
-    <w:pPr>
-      <w:widowControl w:val="false"/>
-      <w:suppressLineNumbers/>
-    </w:pPr>
-    <w:rPr/>
-  </w:style>
-  <w:style w:type="paragraph" w:styleId="Ttulodelatablauser">
-    <w:name w:val="Título de la tabla (user)"/>
-    <w:basedOn w:val="Contenidodelatablauser"/>
-    <w:qFormat/>
-    <w:pPr>
-      <w:suppressLineNumbers/>
-      <w:jc w:val="center"/>
-    </w:pPr>
-    <w:rPr>
-      <w:b/>
-      <w:bCs/>
-    </w:rPr>
-  </w:style>
-  <w:style w:type="numbering" w:styleId="Ningunalista" w:default="1">
-    <w:name w:val="Ninguna lista"/>
+  <w:style w:type="numbering" w:styleId="Ningunalistauser" w:default="1">
+    <w:name w:val="Ninguna lista (user)"/>
     <w:uiPriority w:val="99"/>
     <w:semiHidden/>
     <w:unhideWhenUsed/>

</xml_diff>